<commit_message>
Update CDI contract template
</commit_message>
<xml_diff>
--- a/backend/lib/templates/contract_cdi.docx
+++ b/backend/lib/templates/contract_cdi.docx
@@ -252,33 +252,7 @@
           <w:szCs w:val="24"/>
           <w:rtl/>
         </w:rPr>
-        <w:t>«=</w:t>
-      </w:r>
-      <w:proofErr w:type="spellStart"/>
-      <w:r>
-        <w:rPr>
-          <w:rFonts w:ascii="Arial" w:eastAsia="Arial" w:hAnsi="Arial" w:cs="Louguiya"/>
-          <w:b/>
-          <w:bCs/>
-          <w:color w:val="222222"/>
-          <w:sz w:val="24"/>
-          <w:szCs w:val="24"/>
-          <w:rtl/>
-        </w:rPr>
-        <w:t>contract_number</w:t>
-      </w:r>
-      <w:proofErr w:type="spellEnd"/>
-      <w:r>
-        <w:rPr>
-          <w:rFonts w:ascii="Arial" w:eastAsia="Arial" w:hAnsi="Arial" w:cs="Louguiya"/>
-          <w:b/>
-          <w:bCs/>
-          <w:color w:val="222222"/>
-          <w:sz w:val="24"/>
-          <w:szCs w:val="24"/>
-          <w:rtl/>
-        </w:rPr>
-        <w:t>»</w:t>
+        <w:t>«=contract_number»</w:t>
       </w:r>
       <w:r>
         <w:rPr>
@@ -1138,31 +1112,7 @@
           <w:szCs w:val="24"/>
           <w:rtl/>
         </w:rPr>
-        <w:t>«=</w:t>
-      </w:r>
-      <w:proofErr w:type="spellStart"/>
-      <w:r>
-        <w:rPr>
-          <w:rFonts w:ascii="Arial" w:eastAsia="Arial" w:hAnsi="Arial" w:cs="Louguiya"/>
-          <w:b/>
-          <w:bCs/>
-          <w:sz w:val="24"/>
-          <w:szCs w:val="24"/>
-          <w:rtl/>
-        </w:rPr>
-        <w:t>job_title</w:t>
-      </w:r>
-      <w:proofErr w:type="spellEnd"/>
-      <w:r>
-        <w:rPr>
-          <w:rFonts w:ascii="Arial" w:eastAsia="Arial" w:hAnsi="Arial" w:cs="Louguiya"/>
-          <w:b/>
-          <w:bCs/>
-          <w:sz w:val="24"/>
-          <w:szCs w:val="24"/>
-          <w:rtl/>
-        </w:rPr>
-        <w:t>»</w:t>
+        <w:t>«=job_title»</w:t>
       </w:r>
       <w:r>
         <w:rPr>
@@ -1858,31 +1808,7 @@
           <w:szCs w:val="24"/>
           <w:rtl/>
         </w:rPr>
-        <w:t>«=</w:t>
-      </w:r>
-      <w:proofErr w:type="spellStart"/>
-      <w:r>
-        <w:rPr>
-          <w:rFonts w:ascii="Arial" w:eastAsia="Arial" w:hAnsi="Arial" w:cs="Louguiya"/>
-          <w:b/>
-          <w:bCs/>
-          <w:sz w:val="24"/>
-          <w:szCs w:val="24"/>
-          <w:rtl/>
-        </w:rPr>
-        <w:t>amount</w:t>
-      </w:r>
-      <w:proofErr w:type="spellEnd"/>
-      <w:r>
-        <w:rPr>
-          <w:rFonts w:ascii="Arial" w:eastAsia="Arial" w:hAnsi="Arial" w:cs="Louguiya"/>
-          <w:b/>
-          <w:bCs/>
-          <w:sz w:val="24"/>
-          <w:szCs w:val="24"/>
-          <w:rtl/>
-        </w:rPr>
-        <w:t>»</w:t>
+        <w:t>«=amount»</w:t>
       </w:r>
       <w:r>
         <w:rPr>
@@ -2837,6 +2763,432 @@
         </w:rPr>
       </w:pPr>
     </w:p>
+    <w:tbl>
+      <w:tblPr>
+        <w:tblStyle w:val="TableGrid"/>
+        <w:bidiVisual/>
+        <w:tblW w:w="0" w:type="auto"/>
+        <w:tblBorders>
+          <w:top w:val="none" w:sz="0" w:space="0" w:color="auto"/>
+          <w:left w:val="none" w:sz="0" w:space="0" w:color="auto"/>
+          <w:bottom w:val="none" w:sz="0" w:space="0" w:color="auto"/>
+          <w:right w:val="none" w:sz="0" w:space="0" w:color="auto"/>
+          <w:insideH w:val="none" w:sz="0" w:space="0" w:color="auto"/>
+          <w:insideV w:val="none" w:sz="0" w:space="0" w:color="auto"/>
+        </w:tblBorders>
+        <w:tblLook w:val="04A0" w:firstRow="1" w:lastRow="0" w:firstColumn="1" w:lastColumn="0" w:noHBand="0" w:noVBand="1"/>
+      </w:tblPr>
+      <w:tblGrid>
+        <w:gridCol w:w="4531"/>
+        <w:gridCol w:w="4531"/>
+      </w:tblGrid>
+      <w:tr>
+        <w:tc>
+          <w:tcPr>
+            <w:tcW w:w="4531" w:type="dxa"/>
+          </w:tcPr>
+          <w:p>
+            <w:pPr>
+              <w:widowControl/>
+              <w:bidi/>
+              <w:spacing w:before="120"/>
+              <w:jc w:val="center"/>
+              <w:rPr>
+                <w:rFonts w:ascii="Arial" w:eastAsia="Arial" w:hAnsi="Arial" w:cs="Louguiya"/>
+                <w:color w:val="222222"/>
+                <w:sz w:val="24"/>
+                <w:szCs w:val="24"/>
+                <w:rtl/>
+              </w:rPr>
+            </w:pPr>
+            <w:r>
+              <w:rPr>
+                <w:rFonts w:ascii="Arial" w:eastAsia="Arial" w:hAnsi="Arial" w:cs="Louguiya"/>
+                <w:color w:val="222222"/>
+                <w:sz w:val="24"/>
+                <w:szCs w:val="24"/>
+                <w:highlight w:val="white"/>
+                <w:rtl/>
+              </w:rPr>
+              <w:t>ا</w:t>
+            </w:r>
+            <w:r>
+              <w:rPr>
+                <w:rFonts w:ascii="Arial" w:eastAsia="Arial" w:hAnsi="Arial" w:cs="Louguiya"/>
+                <w:b/>
+                <w:bCs/>
+                <w:color w:val="222222"/>
+                <w:sz w:val="24"/>
+                <w:szCs w:val="24"/>
+                <w:highlight w:val="white"/>
+                <w:rtl/>
+              </w:rPr>
+              <w:t>لطرف الأول (</w:t>
+            </w:r>
+            <w:r>
+              <w:rPr>
+                <w:rFonts w:ascii="Arial" w:eastAsia="Arial" w:hAnsi="Arial" w:cs="Louguiya"/>
+                <w:color w:val="222222"/>
+                <w:sz w:val="24"/>
+                <w:szCs w:val="24"/>
+                <w:highlight w:val="white"/>
+                <w:rtl/>
+              </w:rPr>
+              <w:t xml:space="preserve">منسق برنامج التعليم </w:t>
+            </w:r>
+            <w:proofErr w:type="gramStart"/>
+            <w:r>
+              <w:rPr>
+                <w:rFonts w:ascii="Arial" w:eastAsia="Arial" w:hAnsi="Arial" w:cs="Louguiya" w:hint="cs"/>
+                <w:color w:val="222222"/>
+                <w:sz w:val="24"/>
+                <w:szCs w:val="24"/>
+                <w:highlight w:val="white"/>
+                <w:rtl/>
+              </w:rPr>
+              <w:t xml:space="preserve">الأصلي) </w:t>
+            </w:r>
+            <w:r>
+              <w:rPr>
+                <w:rFonts w:ascii="Arial" w:eastAsia="Arial" w:hAnsi="Arial" w:cs="Louguiya"/>
+                <w:color w:val="222222"/>
+                <w:sz w:val="24"/>
+                <w:szCs w:val="24"/>
+                <w:highlight w:val="white"/>
+              </w:rPr>
+              <w:t xml:space="preserve">  </w:t>
+            </w:r>
+            <w:proofErr w:type="gramEnd"/>
+            <w:r>
+              <w:rPr>
+                <w:rFonts w:ascii="Arial" w:eastAsia="Arial" w:hAnsi="Arial" w:cs="Louguiya"/>
+                <w:color w:val="222222"/>
+                <w:sz w:val="24"/>
+                <w:szCs w:val="24"/>
+                <w:highlight w:val="white"/>
+              </w:rPr>
+              <w:t xml:space="preserve">         </w:t>
+            </w:r>
+            <w:r>
+              <w:rPr>
+                <w:rFonts w:ascii="Arial" w:eastAsia="Arial" w:hAnsi="Arial" w:cs="Louguiya"/>
+                <w:color w:val="222222"/>
+                <w:sz w:val="24"/>
+                <w:szCs w:val="24"/>
+                <w:highlight w:val="white"/>
+                <w:rtl/>
+              </w:rPr>
+              <w:t xml:space="preserve">     </w:t>
+            </w:r>
+          </w:p>
+        </w:tc>
+        <w:tc>
+          <w:tcPr>
+            <w:tcW w:w="4531" w:type="dxa"/>
+          </w:tcPr>
+          <w:p>
+            <w:pPr>
+              <w:widowControl/>
+              <w:shd w:val="clear" w:color="auto" w:fill="FFFFFF"/>
+              <w:bidi/>
+              <w:spacing w:before="120"/>
+              <w:jc w:val="left"/>
+              <w:rPr>
+                <w:rFonts w:ascii="Arial" w:eastAsia="Arial" w:hAnsi="Arial" w:cs="Louguiya"/>
+                <w:color w:val="222222"/>
+                <w:sz w:val="24"/>
+                <w:szCs w:val="24"/>
+                <w:highlight w:val="yellow"/>
+                <w:rtl/>
+              </w:rPr>
+            </w:pPr>
+            <w:r>
+              <w:rPr>
+                <w:rFonts w:ascii="Arial" w:eastAsia="Arial" w:hAnsi="Arial" w:cs="Louguiya"/>
+                <w:color w:val="222222"/>
+                <w:sz w:val="24"/>
+                <w:szCs w:val="24"/>
+                <w:highlight w:val="white"/>
+                <w:rtl/>
+              </w:rPr>
+              <w:t xml:space="preserve">الطرف الثاني </w:t>
+            </w:r>
+            <w:r>
+              <w:rPr>
+                <w:rFonts w:ascii="Arial" w:eastAsia="Arial" w:hAnsi="Arial" w:cs="Louguiya"/>
+                <w:sz w:val="24"/>
+                <w:szCs w:val="24"/>
+                <w:rtl/>
+              </w:rPr>
+              <w:fldChar w:fldCharType="begin"/>
+            </w:r>
+            <w:r>
+              <w:rPr>
+                <w:rFonts w:ascii="Arial" w:eastAsia="Arial" w:hAnsi="Arial" w:cs="Louguiya"/>
+                <w:sz w:val="24"/>
+                <w:szCs w:val="24"/>
+                <w:rtl/>
+              </w:rPr>
+              <w:instrText xml:space="preserve"> MERGEFIELD =job_title \* MERGEFORMAT </w:instrText>
+            </w:r>
+            <w:r>
+              <w:rPr>
+                <w:rFonts w:ascii="Arial" w:eastAsia="Arial" w:hAnsi="Arial" w:cs="Louguiya"/>
+                <w:sz w:val="24"/>
+                <w:szCs w:val="24"/>
+                <w:rtl/>
+              </w:rPr>
+              <w:fldChar w:fldCharType="separate"/>
+            </w:r>
+            <w:r>
+              <w:rPr>
+                <w:rFonts w:ascii="Arial" w:eastAsia="Arial" w:hAnsi="Arial" w:cs="Louguiya"/>
+                <w:b/>
+                <w:bCs/>
+                <w:sz w:val="24"/>
+                <w:szCs w:val="24"/>
+                <w:rtl/>
+              </w:rPr>
+              <w:t>«=</w:t>
+            </w:r>
+            <w:proofErr w:type="spellStart"/>
+            <w:r>
+              <w:rPr>
+                <w:rFonts w:ascii="Arial" w:eastAsia="Arial" w:hAnsi="Arial" w:cs="Louguiya"/>
+                <w:b/>
+                <w:bCs/>
+                <w:sz w:val="24"/>
+                <w:szCs w:val="24"/>
+                <w:rtl/>
+              </w:rPr>
+              <w:t>job_title</w:t>
+            </w:r>
+            <w:proofErr w:type="spellEnd"/>
+            <w:r>
+              <w:rPr>
+                <w:rFonts w:ascii="Arial" w:eastAsia="Arial" w:hAnsi="Arial" w:cs="Louguiya"/>
+                <w:b/>
+                <w:bCs/>
+                <w:sz w:val="24"/>
+                <w:szCs w:val="24"/>
+                <w:rtl/>
+              </w:rPr>
+              <w:t>»</w:t>
+            </w:r>
+            <w:r>
+              <w:rPr>
+                <w:rFonts w:ascii="Arial" w:eastAsia="Arial" w:hAnsi="Arial" w:cs="Louguiya"/>
+                <w:sz w:val="24"/>
+                <w:szCs w:val="24"/>
+                <w:rtl/>
+              </w:rPr>
+              <w:fldChar w:fldCharType="end"/>
+            </w:r>
+          </w:p>
+        </w:tc>
+      </w:tr>
+      <w:tr>
+        <w:tc>
+          <w:tcPr>
+            <w:tcW w:w="4531" w:type="dxa"/>
+          </w:tcPr>
+          <w:p>
+            <w:pPr>
+              <w:widowControl/>
+              <w:shd w:val="clear" w:color="auto" w:fill="FFFFFF"/>
+              <w:tabs>
+                <w:tab w:val="right" w:pos="4315"/>
+              </w:tabs>
+              <w:bidi/>
+              <w:spacing w:before="120"/>
+              <w:jc w:val="left"/>
+              <w:rPr>
+                <w:rFonts w:ascii="Arial" w:eastAsia="Arial" w:hAnsi="Arial" w:cs="Louguiya"/>
+                <w:color w:val="222222"/>
+                <w:sz w:val="24"/>
+                <w:szCs w:val="24"/>
+                <w:highlight w:val="white"/>
+                <w:rtl/>
+              </w:rPr>
+            </w:pPr>
+            <w:r>
+              <w:rPr>
+                <w:rFonts w:ascii="Arial" w:eastAsia="Arial" w:hAnsi="Arial" w:cs="Louguiya"/>
+                <w:color w:val="222222"/>
+                <w:sz w:val="24"/>
+                <w:szCs w:val="24"/>
+                <w:highlight w:val="white"/>
+                <w:rtl/>
+              </w:rPr>
+              <w:t xml:space="preserve">  أن أبوبكر أحمد المعلوم </w:t>
+            </w:r>
+          </w:p>
+        </w:tc>
+        <w:tc>
+          <w:tcPr>
+            <w:tcW w:w="4531" w:type="dxa"/>
+          </w:tcPr>
+          <w:p>
+            <w:pPr>
+              <w:widowControl/>
+              <w:shd w:val="clear" w:color="auto" w:fill="FFFFFF"/>
+              <w:bidi/>
+              <w:spacing w:before="120"/>
+              <w:jc w:val="left"/>
+              <w:rPr>
+                <w:rFonts w:ascii="Arial" w:eastAsia="Arial" w:hAnsi="Arial" w:cs="Louguiya"/>
+                <w:color w:val="222222"/>
+                <w:sz w:val="24"/>
+                <w:szCs w:val="24"/>
+                <w:highlight w:val="white"/>
+                <w:lang w:val="en-US"/>
+              </w:rPr>
+            </w:pPr>
+            <w:r>
+              <w:rPr>
+                <w:rFonts w:ascii="Arial" w:eastAsia="Arial" w:hAnsi="Arial" w:cs="Louguiya"/>
+                <w:color w:val="222222"/>
+                <w:sz w:val="24"/>
+                <w:szCs w:val="24"/>
+                <w:rtl/>
+              </w:rPr>
+              <w:fldChar w:fldCharType="begin"/>
+            </w:r>
+            <w:r>
+              <w:rPr>
+                <w:rFonts w:ascii="Arial" w:eastAsia="Arial" w:hAnsi="Arial" w:cs="Louguiya"/>
+                <w:color w:val="222222"/>
+                <w:sz w:val="24"/>
+                <w:szCs w:val="24"/>
+                <w:rtl/>
+              </w:rPr>
+              <w:instrText xml:space="preserve"> MERGEFIELD =employee_name_fr \* MERGEFORMAT </w:instrText>
+            </w:r>
+            <w:r>
+              <w:rPr>
+                <w:rFonts w:ascii="Arial" w:eastAsia="Arial" w:hAnsi="Arial" w:cs="Louguiya"/>
+                <w:color w:val="222222"/>
+                <w:sz w:val="24"/>
+                <w:szCs w:val="24"/>
+                <w:rtl/>
+              </w:rPr>
+              <w:fldChar w:fldCharType="separate"/>
+            </w:r>
+            <w:r>
+              <w:rPr>
+                <w:rFonts w:ascii="Arial" w:eastAsia="Arial" w:hAnsi="Arial" w:cs="Louguiya"/>
+                <w:b/>
+                <w:bCs/>
+                <w:color w:val="222222"/>
+                <w:sz w:val="24"/>
+                <w:szCs w:val="24"/>
+                <w:rtl/>
+              </w:rPr>
+              <w:t>«=</w:t>
+            </w:r>
+            <w:proofErr w:type="spellStart"/>
+            <w:r>
+              <w:rPr>
+                <w:rFonts w:ascii="Arial" w:eastAsia="Arial" w:hAnsi="Arial" w:cs="Louguiya"/>
+                <w:b/>
+                <w:bCs/>
+                <w:color w:val="222222"/>
+                <w:sz w:val="24"/>
+                <w:szCs w:val="24"/>
+                <w:rtl/>
+              </w:rPr>
+              <w:t>employee_name_fr</w:t>
+            </w:r>
+            <w:proofErr w:type="spellEnd"/>
+            <w:r>
+              <w:rPr>
+                <w:rFonts w:ascii="Arial" w:eastAsia="Arial" w:hAnsi="Arial" w:cs="Louguiya"/>
+                <w:b/>
+                <w:bCs/>
+                <w:color w:val="222222"/>
+                <w:sz w:val="24"/>
+                <w:szCs w:val="24"/>
+                <w:rtl/>
+              </w:rPr>
+              <w:t>»</w:t>
+            </w:r>
+            <w:r>
+              <w:rPr>
+                <w:rFonts w:ascii="Arial" w:eastAsia="Arial" w:hAnsi="Arial" w:cs="Louguiya"/>
+                <w:color w:val="222222"/>
+                <w:sz w:val="24"/>
+                <w:szCs w:val="24"/>
+                <w:rtl/>
+              </w:rPr>
+              <w:fldChar w:fldCharType="end"/>
+            </w:r>
+          </w:p>
+        </w:tc>
+      </w:tr>
+      <w:tr>
+        <w:tc>
+          <w:tcPr>
+            <w:tcW w:w="4531" w:type="dxa"/>
+          </w:tcPr>
+          <w:p>
+            <w:pPr>
+              <w:widowControl/>
+              <w:bidi/>
+              <w:spacing w:before="120"/>
+              <w:jc w:val="left"/>
+              <w:rPr>
+                <w:rFonts w:ascii="Arial" w:eastAsia="Arial" w:hAnsi="Arial" w:cs="Louguiya"/>
+                <w:color w:val="222222"/>
+                <w:sz w:val="24"/>
+                <w:szCs w:val="24"/>
+                <w:rtl/>
+              </w:rPr>
+            </w:pPr>
+            <w:r>
+              <w:rPr>
+                <w:rFonts w:ascii="Arial" w:eastAsia="Arial" w:hAnsi="Arial" w:cs="Louguiya"/>
+                <w:color w:val="222222"/>
+                <w:sz w:val="24"/>
+                <w:szCs w:val="24"/>
+                <w:highlight w:val="white"/>
+                <w:rtl/>
+              </w:rPr>
+              <w:t>التوقيع</w:t>
+            </w:r>
+          </w:p>
+        </w:tc>
+        <w:tc>
+          <w:tcPr>
+            <w:tcW w:w="4531" w:type="dxa"/>
+          </w:tcPr>
+          <w:p>
+            <w:pPr>
+              <w:widowControl/>
+              <w:bidi/>
+              <w:spacing w:before="120"/>
+              <w:rPr>
+                <w:rFonts w:ascii="Arial" w:eastAsia="Arial" w:hAnsi="Arial" w:cs="Louguiya"/>
+                <w:color w:val="222222"/>
+                <w:sz w:val="24"/>
+                <w:szCs w:val="24"/>
+                <w:rtl/>
+              </w:rPr>
+            </w:pPr>
+            <w:r>
+              <w:rPr>
+                <w:rFonts w:ascii="Arial" w:eastAsia="Arial" w:hAnsi="Arial" w:cs="Louguiya" w:hint="cs"/>
+                <w:color w:val="222222"/>
+                <w:sz w:val="24"/>
+                <w:szCs w:val="24"/>
+                <w:highlight w:val="white"/>
+                <w:rtl/>
+              </w:rPr>
+              <w:t>التوقيع</w:t>
+            </w:r>
+          </w:p>
+        </w:tc>
+      </w:tr>
+    </w:tbl>
     <w:p>
       <w:pPr>
         <w:widowControl/>
@@ -2864,300 +3216,19 @@
           <w:color w:val="222222"/>
           <w:sz w:val="24"/>
           <w:szCs w:val="24"/>
-          <w:highlight w:val="yellow"/>
-        </w:rPr>
-      </w:pPr>
-      <w:r>
-        <w:rPr>
-          <w:rFonts w:ascii="Arial" w:eastAsia="Arial" w:hAnsi="Arial" w:cs="Louguiya"/>
-          <w:color w:val="222222"/>
-          <w:sz w:val="24"/>
-          <w:szCs w:val="24"/>
-          <w:highlight w:val="white"/>
-          <w:rtl/>
-        </w:rPr>
-        <w:t>ا</w:t>
-      </w:r>
-      <w:r>
-        <w:rPr>
-          <w:rFonts w:ascii="Arial" w:eastAsia="Arial" w:hAnsi="Arial" w:cs="Louguiya"/>
-          <w:b/>
-          <w:bCs/>
-          <w:color w:val="222222"/>
-          <w:sz w:val="24"/>
-          <w:szCs w:val="24"/>
-          <w:highlight w:val="white"/>
-          <w:rtl/>
-        </w:rPr>
-        <w:t>لطرف الأول (</w:t>
-      </w:r>
-      <w:r>
-        <w:rPr>
-          <w:rFonts w:ascii="Arial" w:eastAsia="Arial" w:hAnsi="Arial" w:cs="Louguiya"/>
-          <w:color w:val="222222"/>
-          <w:sz w:val="24"/>
-          <w:szCs w:val="24"/>
-          <w:highlight w:val="white"/>
-          <w:rtl/>
-        </w:rPr>
-        <w:t xml:space="preserve">منسق برنامج التعليم </w:t>
-      </w:r>
-      <w:proofErr w:type="gramStart"/>
-      <w:r>
-        <w:rPr>
-          <w:rFonts w:ascii="Arial" w:eastAsia="Arial" w:hAnsi="Arial" w:cs="Louguiya" w:hint="cs"/>
-          <w:color w:val="222222"/>
-          <w:sz w:val="24"/>
-          <w:szCs w:val="24"/>
-          <w:highlight w:val="white"/>
-          <w:rtl/>
-        </w:rPr>
-        <w:t xml:space="preserve">الأصلي)  </w:t>
-      </w:r>
-      <w:r>
-        <w:rPr>
-          <w:rFonts w:ascii="Arial" w:eastAsia="Arial" w:hAnsi="Arial" w:cs="Louguiya"/>
-          <w:color w:val="222222"/>
-          <w:sz w:val="24"/>
-          <w:szCs w:val="24"/>
-          <w:highlight w:val="white"/>
-          <w:rtl/>
-        </w:rPr>
-        <w:t xml:space="preserve"> </w:t>
-      </w:r>
-      <w:proofErr w:type="gramEnd"/>
-      <w:r>
-        <w:rPr>
-          <w:rFonts w:ascii="Arial" w:eastAsia="Arial" w:hAnsi="Arial" w:cs="Louguiya"/>
-          <w:color w:val="222222"/>
-          <w:sz w:val="24"/>
-          <w:szCs w:val="24"/>
-          <w:highlight w:val="white"/>
-          <w:rtl/>
-        </w:rPr>
-        <w:t xml:space="preserve">      </w:t>
-      </w:r>
-      <w:r>
-        <w:rPr>
-          <w:rFonts w:ascii="Arial" w:eastAsia="Arial" w:hAnsi="Arial" w:cs="Louguiya"/>
-          <w:color w:val="222222"/>
-          <w:sz w:val="24"/>
-          <w:szCs w:val="24"/>
-          <w:highlight w:val="white"/>
-        </w:rPr>
-        <w:t xml:space="preserve">            </w:t>
-      </w:r>
-      <w:r>
-        <w:rPr>
-          <w:rFonts w:ascii="Arial" w:eastAsia="Arial" w:hAnsi="Arial" w:cs="Louguiya"/>
-          <w:color w:val="222222"/>
-          <w:sz w:val="24"/>
-          <w:szCs w:val="24"/>
-          <w:highlight w:val="white"/>
-          <w:rtl/>
-        </w:rPr>
-        <w:t xml:space="preserve">     الطرف الثاني </w:t>
-      </w:r>
-      <w:r>
-        <w:rPr>
-          <w:rFonts w:ascii="Arial" w:eastAsia="Arial" w:hAnsi="Arial" w:cs="Louguiya"/>
-          <w:sz w:val="24"/>
-          <w:szCs w:val="24"/>
-          <w:rtl/>
-        </w:rPr>
-        <w:fldChar w:fldCharType="begin"/>
-      </w:r>
-      <w:r>
-        <w:rPr>
-          <w:rFonts w:ascii="Arial" w:eastAsia="Arial" w:hAnsi="Arial" w:cs="Louguiya"/>
-          <w:sz w:val="24"/>
-          <w:szCs w:val="24"/>
-          <w:rtl/>
-        </w:rPr>
-        <w:instrText xml:space="preserve"> MERGEFIELD =job_title \* MERGEFORMAT </w:instrText>
-      </w:r>
-      <w:r>
-        <w:rPr>
-          <w:rFonts w:ascii="Arial" w:eastAsia="Arial" w:hAnsi="Arial" w:cs="Louguiya"/>
-          <w:sz w:val="24"/>
-          <w:szCs w:val="24"/>
-          <w:rtl/>
-        </w:rPr>
-        <w:fldChar w:fldCharType="separate"/>
-      </w:r>
-      <w:r>
-        <w:rPr>
-          <w:rFonts w:ascii="Arial" w:eastAsia="Arial" w:hAnsi="Arial" w:cs="Louguiya"/>
-          <w:b/>
-          <w:bCs/>
-          <w:sz w:val="24"/>
-          <w:szCs w:val="24"/>
-          <w:rtl/>
-        </w:rPr>
-        <w:t>«=job_title»</w:t>
-      </w:r>
-      <w:r>
-        <w:rPr>
-          <w:rFonts w:ascii="Arial" w:eastAsia="Arial" w:hAnsi="Arial" w:cs="Louguiya"/>
-          <w:sz w:val="24"/>
-          <w:szCs w:val="24"/>
-          <w:rtl/>
-        </w:rPr>
-        <w:fldChar w:fldCharType="end"/>
-      </w:r>
-    </w:p>
-    <w:p>
-      <w:pPr>
-        <w:widowControl/>
-        <w:shd w:val="clear" w:color="auto" w:fill="FFFFFF"/>
-        <w:bidi/>
-        <w:spacing w:before="120"/>
-        <w:jc w:val="left"/>
-        <w:rPr>
-          <w:rFonts w:ascii="Arial" w:eastAsia="Arial" w:hAnsi="Arial" w:cs="Louguiya"/>
-          <w:color w:val="222222"/>
-          <w:sz w:val="24"/>
-          <w:szCs w:val="24"/>
-          <w:highlight w:val="white"/>
-          <w:rtl/>
-        </w:rPr>
-      </w:pPr>
-      <w:r>
-        <w:rPr>
-          <w:rFonts w:ascii="Arial" w:eastAsia="Arial" w:hAnsi="Arial" w:cs="Louguiya"/>
-          <w:color w:val="222222"/>
-          <w:sz w:val="24"/>
-          <w:szCs w:val="24"/>
-          <w:highlight w:val="white"/>
-          <w:rtl/>
-        </w:rPr>
-        <w:t xml:space="preserve">       أن أبوبكر أحمد المعلوم                   </w:t>
-      </w:r>
-      <w:r>
-        <w:rPr>
-          <w:rFonts w:ascii="Arial" w:eastAsia="Arial" w:hAnsi="Arial" w:cs="Louguiya"/>
-          <w:color w:val="222222"/>
-          <w:sz w:val="24"/>
-          <w:szCs w:val="24"/>
-          <w:highlight w:val="white"/>
-        </w:rPr>
-        <w:t xml:space="preserve">                           </w:t>
-      </w:r>
-      <w:r>
-        <w:rPr>
-          <w:rFonts w:ascii="Arial" w:eastAsia="Arial" w:hAnsi="Arial" w:cs="Louguiya"/>
-          <w:color w:val="222222"/>
-          <w:sz w:val="24"/>
-          <w:szCs w:val="24"/>
-          <w:highlight w:val="white"/>
-          <w:rtl/>
-        </w:rPr>
-        <w:t xml:space="preserve">     </w:t>
-      </w:r>
-      <w:r>
-        <w:rPr>
-          <w:rFonts w:ascii="Arial" w:eastAsia="Arial" w:hAnsi="Arial" w:cs="Louguiya"/>
-          <w:color w:val="222222"/>
-          <w:sz w:val="24"/>
-          <w:szCs w:val="24"/>
-          <w:rtl/>
-        </w:rPr>
-        <w:fldChar w:fldCharType="begin"/>
-      </w:r>
-      <w:r>
-        <w:rPr>
-          <w:rFonts w:ascii="Arial" w:eastAsia="Arial" w:hAnsi="Arial" w:cs="Louguiya"/>
-          <w:color w:val="222222"/>
-          <w:sz w:val="24"/>
-          <w:szCs w:val="24"/>
-          <w:rtl/>
-        </w:rPr>
-        <w:instrText xml:space="preserve"> MERGEFIELD =employee_name_fr \* MERGEFORMAT </w:instrText>
-      </w:r>
-      <w:r>
-        <w:rPr>
-          <w:rFonts w:ascii="Arial" w:eastAsia="Arial" w:hAnsi="Arial" w:cs="Louguiya"/>
-          <w:color w:val="222222"/>
-          <w:sz w:val="24"/>
-          <w:szCs w:val="24"/>
-          <w:rtl/>
-        </w:rPr>
-        <w:fldChar w:fldCharType="separate"/>
-      </w:r>
-      <w:r>
-        <w:rPr>
-          <w:rFonts w:ascii="Arial" w:eastAsia="Arial" w:hAnsi="Arial" w:cs="Louguiya"/>
-          <w:b/>
-          <w:bCs/>
-          <w:color w:val="222222"/>
-          <w:sz w:val="24"/>
-          <w:szCs w:val="24"/>
-          <w:rtl/>
-        </w:rPr>
-        <w:t>«=</w:t>
-      </w:r>
-      <w:proofErr w:type="spellStart"/>
-      <w:r>
-        <w:rPr>
-          <w:rFonts w:ascii="Arial" w:eastAsia="Arial" w:hAnsi="Arial" w:cs="Louguiya"/>
-          <w:b/>
-          <w:bCs/>
-          <w:color w:val="222222"/>
-          <w:sz w:val="24"/>
-          <w:szCs w:val="24"/>
-          <w:rtl/>
-        </w:rPr>
-        <w:t>employee_name_fr</w:t>
-      </w:r>
-      <w:proofErr w:type="spellEnd"/>
-      <w:r>
-        <w:rPr>
-          <w:rFonts w:ascii="Arial" w:eastAsia="Arial" w:hAnsi="Arial" w:cs="Louguiya"/>
-          <w:b/>
-          <w:bCs/>
-          <w:color w:val="222222"/>
-          <w:sz w:val="24"/>
-          <w:szCs w:val="24"/>
-          <w:rtl/>
-        </w:rPr>
-        <w:t>»</w:t>
-      </w:r>
-      <w:r>
-        <w:rPr>
-          <w:rFonts w:ascii="Arial" w:eastAsia="Arial" w:hAnsi="Arial" w:cs="Louguiya"/>
-          <w:color w:val="222222"/>
-          <w:sz w:val="24"/>
-          <w:szCs w:val="24"/>
-          <w:rtl/>
-        </w:rPr>
-        <w:fldChar w:fldCharType="end"/>
-      </w:r>
-    </w:p>
-    <w:p>
-      <w:pPr>
-        <w:widowControl/>
-        <w:shd w:val="clear" w:color="auto" w:fill="FFFFFF"/>
-        <w:bidi/>
-        <w:spacing w:before="120"/>
-        <w:jc w:val="left"/>
-        <w:rPr>
-          <w:rFonts w:ascii="Arial" w:eastAsia="Arial" w:hAnsi="Arial" w:cs="Louguiya"/>
-          <w:color w:val="222222"/>
-          <w:sz w:val="24"/>
-          <w:szCs w:val="24"/>
-          <w:highlight w:val="white"/>
-        </w:rPr>
-      </w:pPr>
-      <w:r>
-        <w:rPr>
-          <w:rFonts w:ascii="Arial" w:eastAsia="Arial" w:hAnsi="Arial" w:cs="Louguiya"/>
-          <w:color w:val="222222"/>
-          <w:sz w:val="24"/>
-          <w:szCs w:val="24"/>
-          <w:highlight w:val="white"/>
-          <w:rtl/>
-        </w:rPr>
-        <w:t xml:space="preserve">  التوقيع </w:t>
+          <w:highlight w:val="white"/>
+        </w:rPr>
+      </w:pPr>
+      <w:r>
+        <w:rPr>
+          <w:rFonts w:ascii="Arial" w:eastAsia="Arial" w:hAnsi="Arial" w:cs="Louguiya"/>
+          <w:color w:val="222222"/>
+          <w:sz w:val="24"/>
+          <w:szCs w:val="24"/>
+          <w:highlight w:val="white"/>
+          <w:rtl/>
+        </w:rPr>
+        <w:t xml:space="preserve">  </w:t>
       </w:r>
       <w:r>
         <w:rPr>
@@ -3219,30 +3290,6 @@
         </w:rPr>
         <w:tab/>
         <w:t xml:space="preserve">  </w:t>
-      </w:r>
-      <w:proofErr w:type="spellStart"/>
-      <w:r>
-        <w:rPr>
-          <w:rFonts w:ascii="Arial" w:eastAsia="Arial" w:hAnsi="Arial" w:cs="Louguiya" w:hint="cs"/>
-          <w:color w:val="222222"/>
-          <w:sz w:val="24"/>
-          <w:szCs w:val="24"/>
-          <w:highlight w:val="white"/>
-          <w:rtl/>
-        </w:rPr>
-        <w:t>التوقيع</w:t>
-      </w:r>
-      <w:proofErr w:type="spellEnd"/>
-      <w:r>
-        <w:rPr>
-          <w:rFonts w:ascii="Arial" w:eastAsia="Arial" w:hAnsi="Arial" w:cs="Louguiya"/>
-          <w:color w:val="222222"/>
-          <w:sz w:val="24"/>
-          <w:szCs w:val="24"/>
-          <w:highlight w:val="white"/>
-          <w:rtl/>
-        </w:rPr>
-        <w:t xml:space="preserve"> </w:t>
       </w:r>
     </w:p>
     <w:p>
@@ -5099,6 +5146,22 @@
       <w:szCs w:val="48"/>
     </w:rPr>
   </w:style>
+  <w:style w:type="table" w:styleId="TableGrid">
+    <w:name w:val="Table Grid"/>
+    <w:basedOn w:val="TableNormal"/>
+    <w:uiPriority w:val="39"/>
+    <w:rsid w:val="00B2232D"/>
+    <w:tblPr>
+      <w:tblBorders>
+        <w:top w:val="single" w:sz="4" w:space="0" w:color="auto"/>
+        <w:left w:val="single" w:sz="4" w:space="0" w:color="auto"/>
+        <w:bottom w:val="single" w:sz="4" w:space="0" w:color="auto"/>
+        <w:right w:val="single" w:sz="4" w:space="0" w:color="auto"/>
+        <w:insideH w:val="single" w:sz="4" w:space="0" w:color="auto"/>
+        <w:insideV w:val="single" w:sz="4" w:space="0" w:color="auto"/>
+      </w:tblBorders>
+    </w:tblPr>
+  </w:style>
 </w:styles>
 </file>
 

</xml_diff>